<commit_message>
Fixe signets template-ater par rapport au fichier d'exemple excel Galaxie EXTETBF.xls
</commit_message>
<xml_diff>
--- a/src/main/webapp/doc/template-ater.docx
+++ b/src/main/webapp/doc/template-ater.docx
@@ -197,7 +197,7 @@
         </w:rPr>
         <w:t xml:space="preserve"> </w:t>
       </w:r>
-      <w:bookmarkStart w:id="0" w:name="Numero_de_lappel_a_candidatures"/>
+      <w:bookmarkStart w:id="0" w:name="N_emploi"/>
       <w:proofErr w:type="spellStart"/>
       <w:r>
         <w:rPr>
@@ -363,7 +363,7 @@
         </w:rPr>
         <w:t xml:space="preserve">  </w:t>
       </w:r>
-      <w:bookmarkStart w:id="1" w:name="Nom_du_candidat"/>
+      <w:bookmarkStart w:id="1" w:name="Nom"/>
       <w:proofErr w:type="spellStart"/>
       <w:r>
         <w:rPr>
@@ -417,7 +417,7 @@
         </w:rPr>
         <w:t xml:space="preserve">  </w:t>
       </w:r>
-      <w:bookmarkStart w:id="2" w:name="Prenom_du_candidat"/>
+      <w:bookmarkStart w:id="2" w:name="Prenom"/>
       <w:proofErr w:type="spellStart"/>
       <w:r>
         <w:rPr>
@@ -480,7 +480,7 @@
         </w:rPr>
         <w:t xml:space="preserve"> </w:t>
       </w:r>
-      <w:bookmarkStart w:id="3" w:name="Date_de_naissance_du_candidat"/>
+      <w:bookmarkStart w:id="3" w:name="Nee_le"/>
       <w:proofErr w:type="spellStart"/>
       <w:r>
         <w:rPr>
@@ -557,7 +557,7 @@
         </w:rPr>
         <w:t xml:space="preserve"> </w:t>
       </w:r>
-      <w:bookmarkStart w:id="4" w:name="Lieu_de_naissance_du_candidat"/>
+      <w:bookmarkStart w:id="4" w:name="Lieu_de_naissance"/>
       <w:proofErr w:type="spellStart"/>
       <w:r>
         <w:rPr>
@@ -635,7 +635,7 @@
         </w:rPr>
         <w:t xml:space="preserve">  </w:t>
       </w:r>
-      <w:bookmarkStart w:id="5" w:name="Ligne_1_de_ladresse_du_candidat"/>
+      <w:bookmarkStart w:id="5" w:name="Adresse1"/>
       <w:r>
         <w:rPr>
           <w:sz w:val="20"/>
@@ -726,7 +726,7 @@
         </w:rPr>
         <w:t xml:space="preserve">          </w:t>
       </w:r>
-      <w:bookmarkStart w:id="6" w:name="Ligne_2_de_ladresse_du_candidat"/>
+      <w:bookmarkStart w:id="6" w:name="Adresse2"/>
       <w:r>
         <w:rPr>
           <w:sz w:val="20"/>
@@ -818,7 +818,7 @@
         <w:tab/>
         <w:t xml:space="preserve">  </w:t>
       </w:r>
-      <w:bookmarkStart w:id="7" w:name="Ligne_3_de_ladresse_du_candidat"/>
+      <w:bookmarkStart w:id="7" w:name="Adresse3"/>
       <w:r>
         <w:rPr>
           <w:sz w:val="20"/>
@@ -910,7 +910,7 @@
         <w:tab/>
         <w:t xml:space="preserve">  </w:t>
       </w:r>
-      <w:bookmarkStart w:id="8" w:name="Code_postal_du_candidat"/>
+      <w:bookmarkStart w:id="8" w:name="Code_postal"/>
       <w:r>
         <w:rPr>
           <w:sz w:val="20"/>
@@ -961,7 +961,7 @@
         </w:rPr>
         <w:t xml:space="preserve">  </w:t>
       </w:r>
-      <w:bookmarkStart w:id="9" w:name="Code_postal_etranger_du_candidat"/>
+      <w:bookmarkStart w:id="9" w:name="Code_etranger"/>
       <w:proofErr w:type="spellStart"/>
       <w:r>
         <w:rPr>
@@ -1026,7 +1026,7 @@
         </w:rPr>
         <w:t xml:space="preserve"> </w:t>
       </w:r>
-      <w:bookmarkStart w:id="10" w:name="Ville_du_candidat"/>
+      <w:bookmarkStart w:id="10" w:name="Ville"/>
       <w:proofErr w:type="spellStart"/>
       <w:r>
         <w:rPr>
@@ -1090,7 +1090,7 @@
         <w:tab/>
         <w:t xml:space="preserve">  </w:t>
       </w:r>
-      <w:bookmarkStart w:id="11" w:name="Pays_du_candidat"/>
+      <w:bookmarkStart w:id="11" w:name="Pays"/>
       <w:proofErr w:type="spellStart"/>
       <w:r>
         <w:rPr>
@@ -1215,7 +1215,7 @@
         </w:rPr>
         <w:t xml:space="preserve"> </w:t>
       </w:r>
-      <w:bookmarkStart w:id="13" w:name="Titre_ou_sujet_de_la_these"/>
+      <w:bookmarkStart w:id="13" w:name="Titre_these"/>
       <w:proofErr w:type="spellStart"/>
       <w:r>
         <w:rPr>
@@ -1339,7 +1339,7 @@
         </w:rPr>
         <w:t xml:space="preserve"> </w:t>
       </w:r>
-      <w:bookmarkStart w:id="14" w:name="Date_de_soutenance"/>
+      <w:bookmarkStart w:id="14" w:name="Date_soutenance"/>
       <w:proofErr w:type="spellStart"/>
       <w:r>
         <w:rPr>
@@ -1392,14 +1392,12 @@
         </w:rPr>
         <w:t xml:space="preserve"> </w:t>
       </w:r>
-      <w:bookmarkStart w:id="15" w:name="Mention"/>
       <w:r>
         <w:rPr>
           <w:sz w:val="20"/>
         </w:rPr>
         <w:t>Mention</w:t>
       </w:r>
-      <w:bookmarkEnd w:id="15"/>
     </w:p>
     <w:p>
       <w:pPr>
@@ -1430,7 +1428,6 @@
         </w:rPr>
         <w:t xml:space="preserve"> </w:t>
       </w:r>
-      <w:bookmarkStart w:id="16" w:name="Etablissement_de_delivrance_du_diplome"/>
       <w:proofErr w:type="spellStart"/>
       <w:r>
         <w:rPr>
@@ -1510,7 +1507,6 @@
         </w:rPr>
         <w:t>me</w:t>
       </w:r>
-      <w:bookmarkEnd w:id="16"/>
       <w:proofErr w:type="spellEnd"/>
     </w:p>
     <w:p>
@@ -1538,7 +1534,7 @@
         </w:rPr>
         <w:t xml:space="preserve"> </w:t>
       </w:r>
-      <w:bookmarkStart w:id="17" w:name="Directeur_de_la_these"/>
+      <w:bookmarkStart w:id="17" w:name="Directeur_These"/>
       <w:proofErr w:type="spellStart"/>
       <w:r>
         <w:rPr>

</xml_diff>